<commit_message>
modificaciones de contrato y template
</commit_message>
<xml_diff>
--- a/templates/contrato.docx
+++ b/templates/contrato.docx
@@ -252,23 +252,7 @@
           <w:rFonts w:ascii="Arial" w:eastAsia="Arial" w:hAnsi="Arial" w:cs="Arial"/>
           <w:color w:val="000000"/>
         </w:rPr>
-        <w:t xml:space="preserve">Que su objetivo principalmente es la compraventa, administración, arrendamiento, subarrendamiento, promoción, proyecto, diseño, construcción, reconstrucción, remodelación, adaptación, decoración, fraccionamiento, lotificación, urbanización, supervisión y mantenimiento de toda clase de bienes inmuebles, pavimentos, canales y drenes de carácter urbano Que señala como su domicilio para todos los efectos que se derivan del presente Contrato, el ubicado </w:t>
-      </w:r>
-      <w:proofErr w:type="gramStart"/>
-      <w:r>
-        <w:rPr>
-          <w:rFonts w:ascii="Arial" w:eastAsia="Arial" w:hAnsi="Arial" w:cs="Arial"/>
-          <w:color w:val="000000"/>
-        </w:rPr>
-        <w:t>en :</w:t>
-      </w:r>
-      <w:proofErr w:type="gramEnd"/>
-      <w:r>
-        <w:rPr>
-          <w:rFonts w:ascii="Arial" w:eastAsia="Arial" w:hAnsi="Arial" w:cs="Arial"/>
-          <w:color w:val="000000"/>
-        </w:rPr>
-        <w:t xml:space="preserve"> BOULEVARD VALLE DE SAN JAVIER 3ER PISO VALLE DE SAN JAVIER No.101 PACHUCA DE SOTO, C.P.42086.</w:t>
+        <w:t>Que su objetivo principalmente es la compraventa, administración, arrendamiento, subarrendamiento, promoción, proyecto, diseño, construcción, reconstrucción, remodelación, adaptación, decoración, fraccionamiento, lotificación, urbanización, supervisión y mantenimiento de toda clase de bienes inmuebles, pavimentos, canales y drenes de carácter urbano Que señala como su domicilio para todos los efectos que se derivan del presente Contrato, el ubicado en : BOULEVARD VALLE DE SAN JAVIER 3ER PISO VALLE DE SAN JAVIER No.101 PACHUCA DE SOTO, C.P.42086.</w:t>
       </w:r>
     </w:p>
     <w:p>
@@ -801,7 +785,15 @@
           <w:b/>
           <w:bCs/>
         </w:rPr>
-        <w:t>{{</w:t>
+        <w:t>$</w:t>
+      </w:r>
+      <w:r>
+        <w:rPr>
+          <w:rFonts w:ascii="Arial" w:eastAsia="Arial" w:hAnsi="Arial" w:cs="Arial"/>
+          <w:b/>
+          <w:bCs/>
+        </w:rPr>
+        <w:t>{</w:t>
       </w:r>
       <w:r>
         <w:rPr>
@@ -817,7 +809,7 @@
           <w:b/>
           <w:bCs/>
         </w:rPr>
-        <w:t>}}</w:t>
+        <w:t>}</w:t>
       </w:r>
       <w:r>
         <w:rPr>
@@ -1007,7 +999,15 @@
           <w:b/>
           <w:bCs/>
         </w:rPr>
-        <w:t xml:space="preserve">alle} </w:t>
+        <w:t>alle}</w:t>
+      </w:r>
+      <w:r>
+        <w:rPr>
+          <w:rFonts w:ascii="Arial" w:eastAsia="Arial" w:hAnsi="Arial" w:cs="Arial"/>
+          <w:b/>
+          <w:bCs/>
+        </w:rPr>
+        <w:t xml:space="preserve"> </w:t>
       </w:r>
       <w:r>
         <w:rPr>
@@ -1031,23 +1031,15 @@
           <w:b/>
           <w:bCs/>
         </w:rPr>
-        <w:t>num_exterior</w:t>
-      </w:r>
-      <w:r>
-        <w:rPr>
-          <w:rFonts w:ascii="Arial" w:eastAsia="Arial" w:hAnsi="Arial" w:cs="Arial"/>
-          <w:b/>
-          <w:bCs/>
-        </w:rPr>
-        <w:t xml:space="preserve">} </w:t>
-      </w:r>
-      <w:r>
-        <w:rPr>
-          <w:rFonts w:ascii="Arial" w:eastAsia="Arial" w:hAnsi="Arial" w:cs="Arial"/>
-          <w:b/>
-          <w:bCs/>
-        </w:rPr>
-        <w:t>$</w:t>
+        <w:t>num_</w:t>
+      </w:r>
+      <w:r>
+        <w:rPr>
+          <w:rFonts w:ascii="Arial" w:eastAsia="Arial" w:hAnsi="Arial" w:cs="Arial"/>
+          <w:b/>
+          <w:bCs/>
+        </w:rPr>
+        <w:t>exterior} $</w:t>
       </w:r>
       <w:r>
         <w:rPr>
@@ -1363,23 +1355,7 @@
           <w:rFonts w:ascii="Arial" w:eastAsia="Arial" w:hAnsi="Arial" w:cs="Arial"/>
           <w:color w:val="000000"/>
         </w:rPr>
-        <w:t xml:space="preserve">Que, SI </w:t>
-      </w:r>
-      <w:proofErr w:type="gramStart"/>
-      <w:r>
-        <w:rPr>
-          <w:rFonts w:ascii="Arial" w:eastAsia="Arial" w:hAnsi="Arial" w:cs="Arial"/>
-          <w:color w:val="000000"/>
-        </w:rPr>
-        <w:t xml:space="preserve">(  </w:t>
-      </w:r>
-      <w:proofErr w:type="gramEnd"/>
-      <w:r>
-        <w:rPr>
-          <w:rFonts w:ascii="Arial" w:eastAsia="Arial" w:hAnsi="Arial" w:cs="Arial"/>
-          <w:color w:val="000000"/>
-        </w:rPr>
-        <w:t xml:space="preserve"> ) NO (   ) tiene contrato o crédito hipotecario vigente con el INFONAVIT.</w:t>
+        <w:t>Que, SI (   ) NO (   ) tiene contrato o crédito hipotecario vigente con el INFONAVIT.</w:t>
       </w:r>
     </w:p>
     <w:p>
@@ -1426,23 +1402,7 @@
           <w:rFonts w:ascii="Arial" w:eastAsia="Arial" w:hAnsi="Arial" w:cs="Arial"/>
           <w:color w:val="000000"/>
         </w:rPr>
-        <w:t xml:space="preserve">Que, SI </w:t>
-      </w:r>
-      <w:proofErr w:type="gramStart"/>
-      <w:r>
-        <w:rPr>
-          <w:rFonts w:ascii="Arial" w:eastAsia="Arial" w:hAnsi="Arial" w:cs="Arial"/>
-          <w:color w:val="000000"/>
-        </w:rPr>
-        <w:t>(  )</w:t>
-      </w:r>
-      <w:proofErr w:type="gramEnd"/>
-      <w:r>
-        <w:rPr>
-          <w:rFonts w:ascii="Arial" w:eastAsia="Arial" w:hAnsi="Arial" w:cs="Arial"/>
-          <w:color w:val="000000"/>
-        </w:rPr>
-        <w:t xml:space="preserve"> NO (  ) tiene una resolución judicial en contra, en materia de PENSIÓN ALIMENTICIA.</w:t>
+        <w:t>Que, SI (  ) NO (  ) tiene una resolución judicial en contra, en materia de PENSIÓN ALIMENTICIA.</w:t>
       </w:r>
     </w:p>
     <w:p>
@@ -2140,7 +2100,6 @@
         </w:rPr>
         <w:t>{</w:t>
       </w:r>
-      <w:proofErr w:type="spellStart"/>
       <w:r>
         <w:rPr>
           <w:rFonts w:ascii="Arial" w:eastAsia="Arial" w:hAnsi="Arial" w:cs="Arial"/>
@@ -2149,7 +2108,6 @@
         </w:rPr>
         <w:t>sdi</w:t>
       </w:r>
-      <w:proofErr w:type="spellEnd"/>
       <w:r>
         <w:rPr>
           <w:rFonts w:ascii="Arial" w:eastAsia="Arial" w:hAnsi="Arial" w:cs="Arial"/>
@@ -2181,7 +2139,23 @@
           <w:b/>
           <w:bCs/>
         </w:rPr>
-        <w:t>{Salario en letra}</w:t>
+        <w:t>{</w:t>
+      </w:r>
+      <w:r>
+        <w:rPr>
+          <w:rFonts w:ascii="Arial" w:eastAsia="Arial" w:hAnsi="Arial" w:cs="Arial"/>
+          <w:b/>
+          <w:bCs/>
+        </w:rPr>
+        <w:t>salario_letra</w:t>
+      </w:r>
+      <w:r>
+        <w:rPr>
+          <w:rFonts w:ascii="Arial" w:eastAsia="Arial" w:hAnsi="Arial" w:cs="Arial"/>
+          <w:b/>
+          <w:bCs/>
+        </w:rPr>
+        <w:t>}</w:t>
       </w:r>
       <w:r>
         <w:rPr>
@@ -2196,7 +2170,25 @@
         <w:rPr>
           <w:rFonts w:ascii="Arial" w:eastAsia="Arial" w:hAnsi="Arial" w:cs="Arial"/>
         </w:rPr>
-        <w:t xml:space="preserve">menos los descuentos y retenciones de Ley correspondientes. Con fundamento en lo dispuesto por artículo 101, párrafo segundo de la Ley Federal del Trabajo, el salario será depositado {{pago}}, mediante transferencia electrónica, en la cuenta bancaria que </w:t>
+        <w:t xml:space="preserve">menos los descuentos y retenciones de Ley correspondientes. Con fundamento en lo dispuesto por artículo 101, párrafo segundo de la Ley Federal del Trabajo, el salario será depositado </w:t>
+      </w:r>
+      <w:r>
+        <w:rPr>
+          <w:rFonts w:ascii="Arial" w:eastAsia="Arial" w:hAnsi="Arial" w:cs="Arial"/>
+        </w:rPr>
+        <w:t>$</w:t>
+      </w:r>
+      <w:r>
+        <w:rPr>
+          <w:rFonts w:ascii="Arial" w:eastAsia="Arial" w:hAnsi="Arial" w:cs="Arial"/>
+        </w:rPr>
+        <w:t>{pago}, mediante transferencia electrónica, en la cuenta bancaria que</w:t>
+      </w:r>
+      <w:r>
+        <w:rPr>
+          <w:rFonts w:ascii="Arial" w:eastAsia="Arial" w:hAnsi="Arial" w:cs="Arial"/>
+        </w:rPr>
+        <w:t xml:space="preserve"> </w:t>
       </w:r>
       <w:r>
         <w:rPr>
@@ -2300,14 +2292,7 @@
         <w:rPr>
           <w:rFonts w:ascii="Arial" w:eastAsia="Arial" w:hAnsi="Arial" w:cs="Arial"/>
         </w:rPr>
-        <w:t xml:space="preserve">a más tardar el día 20 de diciembre de cada año, por concepto del aguinaldo, una cantidad equivalente a 15 días de salario, siempre y </w:t>
-      </w:r>
-      <w:r>
-        <w:rPr>
-          <w:rFonts w:ascii="Arial" w:eastAsia="Arial" w:hAnsi="Arial" w:cs="Arial"/>
-        </w:rPr>
-        <w:lastRenderedPageBreak/>
-        <w:t xml:space="preserve">cuando </w:t>
+        <w:t xml:space="preserve">a más tardar el día 20 de diciembre de cada año, por concepto del aguinaldo, una cantidad equivalente a 15 días de salario, siempre y cuando </w:t>
       </w:r>
       <w:r>
         <w:rPr>
@@ -2337,6 +2322,7 @@
         <w:rPr>
           <w:rFonts w:ascii="Arial" w:eastAsia="Arial" w:hAnsi="Arial" w:cs="Arial"/>
         </w:rPr>
+        <w:lastRenderedPageBreak/>
         <w:t xml:space="preserve">En caso de que </w:t>
       </w:r>
       <w:r>
@@ -2707,14 +2693,20 @@
           <w:b/>
           <w:bCs/>
         </w:rPr>
+        <w:t>"EL TRABAJADOR"</w:t>
+      </w:r>
+      <w:r>
+        <w:rPr>
+          <w:rFonts w:ascii="Arial" w:eastAsia="Arial" w:hAnsi="Arial" w:cs="Arial"/>
+        </w:rPr>
+        <w:t xml:space="preserve"> se obliga a participar en todos y cada uno de los programas de capacitación, adiestramiento y productividad que se establezca en el centro de trabajo, ya sea en forma activa (impartiendo cursos) o recibiéndolos. Las partes convienen que la capacitación podrá hacerse dentro </w:t>
+      </w:r>
+      <w:r>
+        <w:rPr>
+          <w:rFonts w:ascii="Arial" w:eastAsia="Arial" w:hAnsi="Arial" w:cs="Arial"/>
+        </w:rPr>
         <w:lastRenderedPageBreak/>
-        <w:t>"EL TRABAJADOR"</w:t>
-      </w:r>
-      <w:r>
-        <w:rPr>
-          <w:rFonts w:ascii="Arial" w:eastAsia="Arial" w:hAnsi="Arial" w:cs="Arial"/>
-        </w:rPr>
-        <w:t xml:space="preserve"> se obliga a participar en todos y cada uno de los programas de capacitación, adiestramiento y productividad que se establezca en el centro de trabajo, ya sea en forma activa (impartiendo cursos) o recibiéndolos. Las partes convienen que la capacitación podrá hacerse dentro o fuera de los horarios de trabajo, indistintamente, en cumplimiento del Capítulo III Bis, de la Ley Federal del Trabajo. </w:t>
+        <w:t xml:space="preserve">o fuera de los horarios de trabajo, indistintamente, en cumplimiento del Capítulo III Bis, de la Ley Federal del Trabajo. </w:t>
       </w:r>
     </w:p>
     <w:p>
@@ -3043,14 +3035,7 @@
         <w:rPr>
           <w:rFonts w:ascii="Arial" w:eastAsia="Arial" w:hAnsi="Arial" w:cs="Arial"/>
         </w:rPr>
-        <w:t xml:space="preserve">tendrá derecho de tomar asiento </w:t>
-      </w:r>
-      <w:r>
-        <w:rPr>
-          <w:rFonts w:ascii="Arial" w:eastAsia="Arial" w:hAnsi="Arial" w:cs="Arial"/>
-        </w:rPr>
-        <w:lastRenderedPageBreak/>
-        <w:t xml:space="preserve">periódicamente, en la medida de que el desempeño de sus funciones se lo permitan, por lo que no permanecerá de pie durante la totalidad de la jornada laboral. </w:t>
+        <w:t xml:space="preserve">tendrá derecho de tomar asiento periódicamente, en la medida de que el desempeño de sus funciones se lo permitan, por lo que no permanecerá de pie durante la totalidad de la jornada laboral. </w:t>
       </w:r>
     </w:p>
     <w:p>
@@ -3069,6 +3054,7 @@
           <w:bCs/>
           <w:color w:val="000000"/>
         </w:rPr>
+        <w:lastRenderedPageBreak/>
         <w:t>VIGÉSIMA PRIMERA.</w:t>
       </w:r>
       <w:r>
@@ -3245,8 +3231,15 @@
           <w:rFonts w:ascii="Arial" w:eastAsia="Arial" w:hAnsi="Arial" w:cs="Arial"/>
           <w:color w:val="000000"/>
         </w:rPr>
+        <w:t xml:space="preserve">El Trabajador deberá devolver, cualquiera de los medios materiales en donde conste la información, tales como documentos, medios electrónicos, magnéticos, discos ópticos, microfilmes, películas u otros instrumentos similares que le haya confiado el Patrón con motivo de sus labores. Así como </w:t>
+      </w:r>
+      <w:r>
+        <w:rPr>
+          <w:rFonts w:ascii="Arial" w:eastAsia="Arial" w:hAnsi="Arial" w:cs="Arial"/>
+          <w:color w:val="000000"/>
+        </w:rPr>
         <w:lastRenderedPageBreak/>
-        <w:t>El Trabajador deberá devolver, cualquiera de los medios materiales en donde conste la información, tales como documentos, medios electrónicos, magnéticos, discos ópticos, microfilmes, películas u otros instrumentos similares que le haya confiado el Patrón con motivo de sus labores. Así como también los diarios, memorias, notas, correspondencia, dibujos, planos, especificaciones y otros documentos relacionados directa o indirectamente con la información que haya elaborado, recopilado u obtenido del Patrón, de sus subsidiarias y/o filiales o de cualquier tercero relacionado con éste.</w:t>
+        <w:t>también los diarios, memorias, notas, correspondencia, dibujos, planos, especificaciones y otros documentos relacionados directa o indirectamente con la información que haya elaborado, recopilado u obtenido del Patrón, de sus subsidiarias y/o filiales o de cualquier tercero relacionado con éste.</w:t>
       </w:r>
     </w:p>
     <w:p>
@@ -3467,56 +3460,48 @@
         <w:rPr>
           <w:rFonts w:ascii="Arial" w:eastAsia="Arial" w:hAnsi="Arial" w:cs="Arial"/>
         </w:rPr>
+        <w:t xml:space="preserve">Leído integralmente el presente contrato y entendido de su valor, alcance y fuerza legal, </w:t>
+      </w:r>
+      <w:r>
+        <w:rPr>
+          <w:rFonts w:ascii="Arial" w:eastAsia="Arial" w:hAnsi="Arial" w:cs="Arial"/>
+          <w:b/>
+          <w:bCs/>
+        </w:rPr>
+        <w:t xml:space="preserve">“EL TRABAJADOR” </w:t>
+      </w:r>
+      <w:r>
+        <w:rPr>
+          <w:rFonts w:ascii="Arial" w:eastAsia="Arial" w:hAnsi="Arial" w:cs="Arial"/>
+        </w:rPr>
+        <w:t xml:space="preserve">y el representante de </w:t>
+      </w:r>
+      <w:r>
+        <w:rPr>
+          <w:rFonts w:ascii="Arial" w:eastAsia="Arial" w:hAnsi="Arial" w:cs="Arial"/>
+          <w:b/>
+          <w:bCs/>
+        </w:rPr>
+        <w:t>“EL PATRÓN”</w:t>
+      </w:r>
+      <w:r>
+        <w:rPr>
+          <w:rFonts w:ascii="Arial" w:eastAsia="Arial" w:hAnsi="Arial" w:cs="Arial"/>
+        </w:rPr>
+        <w:t xml:space="preserve"> lo ratifican y firman de conformidad por </w:t>
+      </w:r>
+      <w:r>
+        <w:rPr>
+          <w:rFonts w:ascii="Arial" w:eastAsia="Arial" w:hAnsi="Arial" w:cs="Arial"/>
+        </w:rPr>
         <w:lastRenderedPageBreak/>
-        <w:t xml:space="preserve">Leído integralmente el presente contrato y entendido de su valor, alcance y fuerza legal, </w:t>
-      </w:r>
-      <w:r>
-        <w:rPr>
-          <w:rFonts w:ascii="Arial" w:eastAsia="Arial" w:hAnsi="Arial" w:cs="Arial"/>
-          <w:b/>
-          <w:bCs/>
-        </w:rPr>
-        <w:t xml:space="preserve">“EL TRABAJADOR” </w:t>
-      </w:r>
-      <w:r>
-        <w:rPr>
-          <w:rFonts w:ascii="Arial" w:eastAsia="Arial" w:hAnsi="Arial" w:cs="Arial"/>
-        </w:rPr>
-        <w:t xml:space="preserve">y el representante de </w:t>
-      </w:r>
-      <w:r>
-        <w:rPr>
-          <w:rFonts w:ascii="Arial" w:eastAsia="Arial" w:hAnsi="Arial" w:cs="Arial"/>
-          <w:b/>
-          <w:bCs/>
-        </w:rPr>
-        <w:t>“EL PATRÓN”</w:t>
-      </w:r>
-      <w:r>
-        <w:rPr>
-          <w:rFonts w:ascii="Arial" w:eastAsia="Arial" w:hAnsi="Arial" w:cs="Arial"/>
-        </w:rPr>
-        <w:t xml:space="preserve"> lo ratifican y firman de conformidad por duplicado, quedando uno en poder de cada una de las partes, en Tepeji del río de Ocampo, Estado de Hidalgo a</w:t>
-      </w:r>
-      <w:r>
-        <w:rPr>
-          <w:rFonts w:ascii="Arial" w:eastAsia="Arial" w:hAnsi="Arial" w:cs="Arial"/>
-        </w:rPr>
-        <w:t xml:space="preserve"> ${</w:t>
-      </w:r>
-      <w:proofErr w:type="spellStart"/>
-      <w:r>
-        <w:rPr>
-          <w:rFonts w:ascii="Arial" w:eastAsia="Arial" w:hAnsi="Arial" w:cs="Arial"/>
-        </w:rPr>
-        <w:t>fecha_ingreso</w:t>
-      </w:r>
-      <w:proofErr w:type="spellEnd"/>
-      <w:r>
-        <w:rPr>
-          <w:rFonts w:ascii="Arial" w:eastAsia="Arial" w:hAnsi="Arial" w:cs="Arial"/>
-        </w:rPr>
-        <w:t>}.</w:t>
+        <w:t>duplicado, quedando uno en poder de cada una de las partes, en Tepeji del río de Ocampo, Estado de Hidalgo a</w:t>
+      </w:r>
+      <w:r>
+        <w:rPr>
+          <w:rFonts w:ascii="Arial" w:eastAsia="Arial" w:hAnsi="Arial" w:cs="Arial"/>
+        </w:rPr>
+        <w:t xml:space="preserve"> ${fecha_ingreso}.</w:t>
       </w:r>
     </w:p>
     <w:p>
@@ -4147,21 +4132,7 @@
           <w:rFonts w:ascii="Arial" w:eastAsia="Arial" w:hAnsi="Arial" w:cs="Arial"/>
         </w:rPr>
         <w:lastRenderedPageBreak/>
-        <w:t>${</w:t>
-      </w:r>
-      <w:proofErr w:type="spellStart"/>
-      <w:r>
-        <w:rPr>
-          <w:rFonts w:ascii="Arial" w:eastAsia="Arial" w:hAnsi="Arial" w:cs="Arial"/>
-        </w:rPr>
-        <w:t>fecha_ingreso</w:t>
-      </w:r>
-      <w:proofErr w:type="spellEnd"/>
-      <w:r>
-        <w:rPr>
-          <w:rFonts w:ascii="Arial" w:eastAsia="Arial" w:hAnsi="Arial" w:cs="Arial"/>
-        </w:rPr>
-        <w:t>}</w:t>
+        <w:t>${fecha_ingreso}</w:t>
       </w:r>
     </w:p>
     <w:tbl>
@@ -4303,6 +4274,7 @@
               <w:right w:val="single" w:sz="4" w:space="0" w:color="000000"/>
             </w:tcBorders>
             <w:shd w:val="clear" w:color="auto" w:fill="A6A6A6"/>
+            <w:vAlign w:val="center"/>
           </w:tcPr>
           <w:p>
             <w:pPr>
@@ -4337,6 +4309,7 @@
               <w:bottom w:val="single" w:sz="4" w:space="0" w:color="000000"/>
               <w:right w:val="single" w:sz="4" w:space="0" w:color="000000"/>
             </w:tcBorders>
+            <w:vAlign w:val="center"/>
           </w:tcPr>
           <w:p>
             <w:pPr>
@@ -4370,6 +4343,7 @@
               <w:right w:val="single" w:sz="4" w:space="0" w:color="000000"/>
             </w:tcBorders>
             <w:shd w:val="clear" w:color="auto" w:fill="A6A6A6"/>
+            <w:vAlign w:val="center"/>
           </w:tcPr>
           <w:p>
             <w:pPr>
@@ -4377,7 +4351,6 @@
                 <w:tab w:val="left" w:pos="360"/>
               </w:tabs>
               <w:ind w:left="44" w:hanging="4"/>
-              <w:jc w:val="both"/>
               <w:cnfStyle w:val="000000000000" w:firstRow="0" w:lastRow="0" w:firstColumn="0" w:lastColumn="0" w:oddVBand="0" w:evenVBand="0" w:oddHBand="0" w:evenHBand="0" w:firstRowFirstColumn="0" w:firstRowLastColumn="0" w:lastRowFirstColumn="0" w:lastRowLastColumn="0"/>
               <w:rPr>
                 <w:b/>
@@ -4407,13 +4380,13 @@
               <w:bottom w:val="single" w:sz="4" w:space="0" w:color="000000"/>
               <w:right w:val="single" w:sz="4" w:space="0" w:color="000000"/>
             </w:tcBorders>
+            <w:vAlign w:val="center"/>
           </w:tcPr>
           <w:p>
             <w:pPr>
               <w:tabs>
                 <w:tab w:val="left" w:pos="360"/>
               </w:tabs>
-              <w:jc w:val="both"/>
               <w:cnfStyle w:val="000000000000" w:firstRow="0" w:lastRow="0" w:firstColumn="0" w:lastColumn="0" w:oddVBand="0" w:evenVBand="0" w:oddHBand="0" w:evenHBand="0" w:firstRowFirstColumn="0" w:firstRowLastColumn="0" w:lastRowFirstColumn="0" w:lastRowLastColumn="0"/>
             </w:pPr>
             <w:r>
@@ -4438,6 +4411,7 @@
               <w:right w:val="single" w:sz="4" w:space="0" w:color="000000"/>
             </w:tcBorders>
             <w:shd w:val="clear" w:color="auto" w:fill="A6A6A6"/>
+            <w:vAlign w:val="center"/>
           </w:tcPr>
           <w:p>
             <w:pPr>
@@ -4445,7 +4419,6 @@
                 <w:tab w:val="left" w:pos="360"/>
               </w:tabs>
               <w:ind w:left="44" w:hanging="4"/>
-              <w:jc w:val="both"/>
               <w:cnfStyle w:val="000000000000" w:firstRow="0" w:lastRow="0" w:firstColumn="0" w:lastColumn="0" w:oddVBand="0" w:evenVBand="0" w:oddHBand="0" w:evenHBand="0" w:firstRowFirstColumn="0" w:firstRowLastColumn="0" w:lastRowFirstColumn="0" w:lastRowLastColumn="0"/>
               <w:rPr>
                 <w:b/>
@@ -4471,13 +4444,13 @@
               <w:bottom w:val="single" w:sz="4" w:space="0" w:color="000000"/>
               <w:right w:val="single" w:sz="4" w:space="0" w:color="000000"/>
             </w:tcBorders>
+            <w:vAlign w:val="center"/>
           </w:tcPr>
           <w:p>
             <w:pPr>
               <w:tabs>
                 <w:tab w:val="left" w:pos="360"/>
               </w:tabs>
-              <w:jc w:val="both"/>
               <w:cnfStyle w:val="000000000000" w:firstRow="0" w:lastRow="0" w:firstColumn="0" w:lastColumn="0" w:oddVBand="0" w:evenVBand="0" w:oddHBand="0" w:evenHBand="0" w:firstRowFirstColumn="0" w:firstRowLastColumn="0" w:lastRowFirstColumn="0" w:lastRowLastColumn="0"/>
             </w:pPr>
             <w:r>
@@ -5314,10 +5287,7 @@
               <w:cnfStyle w:val="000000100000" w:firstRow="0" w:lastRow="0" w:firstColumn="0" w:lastColumn="0" w:oddVBand="0" w:evenVBand="0" w:oddHBand="1" w:evenHBand="0" w:firstRowFirstColumn="0" w:firstRowLastColumn="0" w:lastRowFirstColumn="0" w:lastRowLastColumn="0"/>
             </w:pPr>
             <w:r>
-              <w:t>$</w:t>
-            </w:r>
-            <w:r>
-              <w:t>{Puesto}</w:t>
+              <w:t>${puesto}</w:t>
             </w:r>
           </w:p>
         </w:tc>
@@ -5525,7 +5495,23 @@
                 <w:sz w:val="24"/>
                 <w:szCs w:val="24"/>
               </w:rPr>
-              <w:t>{Banco}</w:t>
+              <w:t>{</w:t>
+            </w:r>
+            <w:r>
+              <w:rPr>
+                <w:color w:val="000000"/>
+                <w:sz w:val="24"/>
+                <w:szCs w:val="24"/>
+              </w:rPr>
+              <w:t>b</w:t>
+            </w:r>
+            <w:r>
+              <w:rPr>
+                <w:color w:val="000000"/>
+                <w:sz w:val="24"/>
+                <w:szCs w:val="24"/>
+              </w:rPr>
+              <w:t>anco}</w:t>
             </w:r>
           </w:p>
         </w:tc>
@@ -5887,21 +5873,7 @@
           <w:rFonts w:ascii="Arial" w:eastAsia="Arial" w:hAnsi="Arial" w:cs="Arial"/>
         </w:rPr>
         <w:lastRenderedPageBreak/>
-        <w:t>${</w:t>
-      </w:r>
-      <w:proofErr w:type="spellStart"/>
-      <w:r>
-        <w:rPr>
-          <w:rFonts w:ascii="Arial" w:eastAsia="Arial" w:hAnsi="Arial" w:cs="Arial"/>
-        </w:rPr>
-        <w:t>fecha_ingreso</w:t>
-      </w:r>
-      <w:proofErr w:type="spellEnd"/>
-      <w:r>
-        <w:rPr>
-          <w:rFonts w:ascii="Arial" w:eastAsia="Arial" w:hAnsi="Arial" w:cs="Arial"/>
-        </w:rPr>
-        <w:t>}</w:t>
+        <w:t>${fecha_ingreso}</w:t>
       </w:r>
     </w:p>
     <w:p>
@@ -6039,7 +6011,10 @@
               <w:t>$</w:t>
             </w:r>
             <w:r>
-              <w:t>{Nombre Completo}</w:t>
+              <w:t>{nombre</w:t>
+            </w:r>
+            <w:r>
+              <w:t>}</w:t>
             </w:r>
           </w:p>
         </w:tc>
@@ -6060,6 +6035,7 @@
               <w:right w:val="single" w:sz="4" w:space="0" w:color="000000"/>
             </w:tcBorders>
             <w:shd w:val="clear" w:color="auto" w:fill="A6A6A6"/>
+            <w:vAlign w:val="center"/>
           </w:tcPr>
           <w:p>
             <w:pPr>
@@ -6094,6 +6070,7 @@
               <w:bottom w:val="single" w:sz="4" w:space="0" w:color="000000"/>
               <w:right w:val="single" w:sz="4" w:space="0" w:color="000000"/>
             </w:tcBorders>
+            <w:vAlign w:val="center"/>
           </w:tcPr>
           <w:p>
             <w:pPr>
@@ -6133,6 +6110,7 @@
               <w:right w:val="single" w:sz="4" w:space="0" w:color="000000"/>
             </w:tcBorders>
             <w:shd w:val="clear" w:color="auto" w:fill="A6A6A6"/>
+            <w:vAlign w:val="center"/>
           </w:tcPr>
           <w:p>
             <w:pPr>
@@ -6140,7 +6118,6 @@
                 <w:tab w:val="left" w:pos="360"/>
               </w:tabs>
               <w:ind w:left="44" w:hanging="4"/>
-              <w:jc w:val="both"/>
               <w:cnfStyle w:val="000000000000" w:firstRow="0" w:lastRow="0" w:firstColumn="0" w:lastColumn="0" w:oddVBand="0" w:evenVBand="0" w:oddHBand="0" w:evenHBand="0" w:firstRowFirstColumn="0" w:firstRowLastColumn="0" w:lastRowFirstColumn="0" w:lastRowLastColumn="0"/>
               <w:rPr>
                 <w:b/>
@@ -6170,13 +6147,13 @@
               <w:bottom w:val="single" w:sz="4" w:space="0" w:color="000000"/>
               <w:right w:val="single" w:sz="4" w:space="0" w:color="000000"/>
             </w:tcBorders>
+            <w:vAlign w:val="center"/>
           </w:tcPr>
           <w:p>
             <w:pPr>
               <w:tabs>
                 <w:tab w:val="left" w:pos="360"/>
               </w:tabs>
-              <w:jc w:val="both"/>
               <w:cnfStyle w:val="000000000000" w:firstRow="0" w:lastRow="0" w:firstColumn="0" w:lastColumn="0" w:oddVBand="0" w:evenVBand="0" w:oddHBand="0" w:evenHBand="0" w:firstRowFirstColumn="0" w:firstRowLastColumn="0" w:lastRowFirstColumn="0" w:lastRowLastColumn="0"/>
             </w:pPr>
             <w:r>
@@ -6204,6 +6181,7 @@
               <w:right w:val="single" w:sz="4" w:space="0" w:color="000000"/>
             </w:tcBorders>
             <w:shd w:val="clear" w:color="auto" w:fill="A6A6A6"/>
+            <w:vAlign w:val="center"/>
           </w:tcPr>
           <w:p>
             <w:pPr>
@@ -6211,7 +6189,6 @@
                 <w:tab w:val="left" w:pos="360"/>
               </w:tabs>
               <w:ind w:left="44" w:hanging="4"/>
-              <w:jc w:val="both"/>
               <w:cnfStyle w:val="000000000000" w:firstRow="0" w:lastRow="0" w:firstColumn="0" w:lastColumn="0" w:oddVBand="0" w:evenVBand="0" w:oddHBand="0" w:evenHBand="0" w:firstRowFirstColumn="0" w:firstRowLastColumn="0" w:lastRowFirstColumn="0" w:lastRowLastColumn="0"/>
               <w:rPr>
                 <w:b/>
@@ -6237,13 +6214,13 @@
               <w:bottom w:val="single" w:sz="4" w:space="0" w:color="000000"/>
               <w:right w:val="single" w:sz="4" w:space="0" w:color="000000"/>
             </w:tcBorders>
+            <w:vAlign w:val="center"/>
           </w:tcPr>
           <w:p>
             <w:pPr>
               <w:tabs>
                 <w:tab w:val="left" w:pos="360"/>
               </w:tabs>
-              <w:jc w:val="both"/>
               <w:cnfStyle w:val="000000000000" w:firstRow="0" w:lastRow="0" w:firstColumn="0" w:lastColumn="0" w:oddVBand="0" w:evenVBand="0" w:oddHBand="0" w:evenHBand="0" w:firstRowFirstColumn="0" w:firstRowLastColumn="0" w:lastRowFirstColumn="0" w:lastRowLastColumn="0"/>
             </w:pPr>
             <w:r>
@@ -7098,16 +7075,7 @@
               <w:cnfStyle w:val="000000100000" w:firstRow="0" w:lastRow="0" w:firstColumn="0" w:lastColumn="0" w:oddVBand="0" w:evenVBand="0" w:oddHBand="1" w:evenHBand="0" w:firstRowFirstColumn="0" w:firstRowLastColumn="0" w:lastRowFirstColumn="0" w:lastRowLastColumn="0"/>
             </w:pPr>
             <w:r>
-              <w:t>$</w:t>
-            </w:r>
-            <w:r>
-              <w:t>{</w:t>
-            </w:r>
-            <w:r>
-              <w:t>p</w:t>
-            </w:r>
-            <w:r>
-              <w:t>uesto}</w:t>
+              <w:t>${puesto}</w:t>
             </w:r>
           </w:p>
         </w:tc>
@@ -8281,25 +8249,7 @@
                 <w:sz w:val="16"/>
                 <w:szCs w:val="16"/>
               </w:rPr>
-              <w:t xml:space="preserve">Nombre y Firma del </w:t>
-            </w:r>
-            <w:proofErr w:type="gramStart"/>
-            <w:r>
-              <w:rPr>
-                <w:color w:val="FFFFFF"/>
-                <w:sz w:val="16"/>
-                <w:szCs w:val="16"/>
-              </w:rPr>
-              <w:t>Responsable</w:t>
-            </w:r>
-            <w:proofErr w:type="gramEnd"/>
-            <w:r>
-              <w:rPr>
-                <w:color w:val="FFFFFF"/>
-                <w:sz w:val="16"/>
-                <w:szCs w:val="16"/>
-              </w:rPr>
-              <w:t xml:space="preserve"> de Recursos Humanos</w:t>
+              <w:t>Nombre y Firma del Responsable de Recursos Humanos</w:t>
             </w:r>
           </w:p>
         </w:tc>

</xml_diff>